<commit_message>
Replace all generic fill_in_value/fill_in_detail with semantic field names
Audit and rename every instance of fill_in_value and fill_in_detail
across 9 templates to prevent field collisions and ensure AI agents
place the right content in the right field.

24 unique semantic field names introduced, including:
- use_limitations, custom_fee_structure, professional_services_billing
- rejection_period_value, resubmission_period_value, term_duration_value
- changes_to_standard_terms, other_security_certification
- company/partner_promotional_activities_detail, _materials_detail,
  _sponsored_benefits_detail, _referral_criteria, _payment_detail
- increased/unlimited_claim_other_detail
- additional_warranty_provider/customer/company/partner_detail
- payment_schedule_detail, invoice_cadence, customer_obligations

Templates: order-form, order-form-with-sla, statement-of-work, PSA,
partnership, csa-with-ai, csa-with-sla, csa-without-sla, DPA.
</commit_message>
<xml_diff>
--- a/content/templates/common-paper-csa-with-ai/template.docx
+++ b/content/templates/common-paper-csa-with-ai/template.docx
@@ -1452,7 +1452,7 @@
                 <w:highlight w:val="yellow"/>
                 <w:rtl w:val="0"/>
               </w:rPr>
-              <w:t xml:space="preserve">{fill_in_value}</w:t>
+              <w:t xml:space="preserve">{custom_fee_structure}</w:t>
             </w:r>
           </w:p>
           <w:p>
@@ -6192,7 +6192,7 @@
                 <w:highlight w:val="yellow"/>
                 <w:rtl w:val="0"/>
               </w:rPr>
-              <w:t xml:space="preserve">{fill_in_value}</w:t>
+              <w:t xml:space="preserve">{increased_claim_other_detail}</w:t>
             </w:r>
           </w:p>
         </w:tc>
@@ -6863,7 +6863,7 @@
                 <w:highlight w:val="yellow"/>
                 <w:rtl w:val="0"/>
               </w:rPr>
-              <w:t xml:space="preserve">{fill_in_value}</w:t>
+              <w:t xml:space="preserve">{unlimited_claim_other_detail}</w:t>
             </w:r>
           </w:p>
         </w:tc>
@@ -7027,7 +7027,7 @@
                 <w:highlight w:val="yellow"/>
                 <w:rtl w:val="0"/>
               </w:rPr>
-              <w:t xml:space="preserve">{fill_in_value}</w:t>
+              <w:t xml:space="preserve">{additional_warranty_provider_detail}</w:t>
             </w:r>
           </w:p>
           <w:p>
@@ -7100,7 +7100,7 @@
                 <w:highlight w:val="yellow"/>
                 <w:rtl w:val="0"/>
               </w:rPr>
-              <w:t xml:space="preserve">{fill_in_value}</w:t>
+              <w:t xml:space="preserve">{additional_warranty_customer_detail}</w:t>
             </w:r>
           </w:p>
         </w:tc>
@@ -9678,7 +9678,7 @@
                       <w:highlight w:val="yellow"/>
                       <w:rtl w:val="0"/>
                     </w:rPr>
-                    <w:t xml:space="preserve">{fill_in_value}</w:t>
+                    <w:t xml:space="preserve">{other_security_certification}</w:t>
                   </w:r>
                 </w:p>
               </w:tc>

</xml_diff>